<commit_message>
Standard level methods added
</commit_message>
<xml_diff>
--- a/UML/Insurance_Full_Test_Case.docx
+++ b/UML/Insurance_Full_Test_Case.docx
@@ -33,8 +33,13 @@
         <w:pStyle w:val="Heading1"/>
       </w:pPr>
       <w:r>
-        <w:t>2. Test Data / Instances</w:t>
+        <w:t xml:space="preserve">2. </w:t>
       </w:r>
+      <w:proofErr w:type="spellStart"/>
+      <w:r>
+        <w:t>cvvvxxc</w:t>
+      </w:r>
+      <w:proofErr w:type="spellEnd"/>
     </w:p>
     <w:p>
       <w:pPr>
@@ -3000,7 +3005,13 @@
       </w:pPr>
       <w:r>
         <w:lastRenderedPageBreak/>
-        <w:t>BMW X5: $52,000 × 1.10 = $57,200.</w:t>
+        <w:t>BMW X5: $52,000 × 1.10 = $</w:t>
+      </w:r>
+      <w:r>
+        <w:t>57</w:t>
+      </w:r>
+      <w:r>
+        <w:t>,200.</w:t>
       </w:r>
     </w:p>
     <w:p>
@@ -4637,12 +4648,304 @@
         </w:tc>
       </w:tr>
     </w:tbl>
+    <w:p/>
+    <w:p>
+      <w:pPr>
+        <w:rPr>
+          <w:rFonts w:hint="eastAsia"/>
+          <w:b/>
+          <w:bCs/>
+        </w:rPr>
+      </w:pPr>
+      <w:r>
+        <w:rPr>
+          <w:b/>
+          <w:bCs/>
+        </w:rPr>
+        <w:t xml:space="preserve">Pictures of console after test: </w:t>
+      </w:r>
+    </w:p>
     <w:p>
       <w:pPr>
         <w:rPr>
           <w:rFonts w:hint="eastAsia"/>
         </w:rPr>
       </w:pPr>
+      <w:r>
+        <w:rPr>
+          <w:rFonts w:hint="eastAsia"/>
+          <w:noProof/>
+        </w:rPr>
+        <w:lastRenderedPageBreak/>
+        <w:drawing>
+          <wp:inline distT="0" distB="0" distL="0" distR="0" wp14:anchorId="6F597C73" wp14:editId="62B5DA9B">
+            <wp:extent cx="6388100" cy="4648200"/>
+            <wp:effectExtent l="0" t="0" r="0" b="0"/>
+            <wp:docPr id="6" name="Picture 6"/>
+            <wp:cNvGraphicFramePr>
+              <a:graphicFrameLocks xmlns:a="http://schemas.openxmlformats.org/drawingml/2006/main" noChangeAspect="1"/>
+            </wp:cNvGraphicFramePr>
+            <a:graphic xmlns:a="http://schemas.openxmlformats.org/drawingml/2006/main">
+              <a:graphicData uri="http://schemas.openxmlformats.org/drawingml/2006/picture">
+                <pic:pic xmlns:pic="http://schemas.openxmlformats.org/drawingml/2006/picture">
+                  <pic:nvPicPr>
+                    <pic:cNvPr id="0" name="Picture 6"/>
+                    <pic:cNvPicPr>
+                      <a:picLocks noChangeAspect="1" noChangeArrowheads="1"/>
+                    </pic:cNvPicPr>
+                  </pic:nvPicPr>
+                  <pic:blipFill>
+                    <a:blip r:embed="rId6">
+                      <a:extLst>
+                        <a:ext uri="{28A0092B-C50C-407E-A947-70E740481C1C}">
+                          <a14:useLocalDpi xmlns:a14="http://schemas.microsoft.com/office/drawing/2010/main" val="0"/>
+                        </a:ext>
+                      </a:extLst>
+                    </a:blip>
+                    <a:srcRect/>
+                    <a:stretch>
+                      <a:fillRect/>
+                    </a:stretch>
+                  </pic:blipFill>
+                  <pic:spPr bwMode="auto">
+                    <a:xfrm>
+                      <a:off x="0" y="0"/>
+                      <a:ext cx="6388100" cy="4648200"/>
+                    </a:xfrm>
+                    <a:prstGeom prst="rect">
+                      <a:avLst/>
+                    </a:prstGeom>
+                    <a:noFill/>
+                    <a:ln>
+                      <a:noFill/>
+                    </a:ln>
+                  </pic:spPr>
+                </pic:pic>
+              </a:graphicData>
+            </a:graphic>
+          </wp:inline>
+        </w:drawing>
+      </w:r>
+      <w:r>
+        <w:rPr>
+          <w:rFonts w:hint="eastAsia"/>
+          <w:noProof/>
+        </w:rPr>
+        <w:lastRenderedPageBreak/>
+        <w:drawing>
+          <wp:inline distT="0" distB="0" distL="0" distR="0" wp14:anchorId="76A4A8E0" wp14:editId="3783D95B">
+            <wp:extent cx="6400800" cy="4635500"/>
+            <wp:effectExtent l="0" t="0" r="0" b="0"/>
+            <wp:docPr id="7" name="Picture 7"/>
+            <wp:cNvGraphicFramePr>
+              <a:graphicFrameLocks xmlns:a="http://schemas.openxmlformats.org/drawingml/2006/main" noChangeAspect="1"/>
+            </wp:cNvGraphicFramePr>
+            <a:graphic xmlns:a="http://schemas.openxmlformats.org/drawingml/2006/main">
+              <a:graphicData uri="http://schemas.openxmlformats.org/drawingml/2006/picture">
+                <pic:pic xmlns:pic="http://schemas.openxmlformats.org/drawingml/2006/picture">
+                  <pic:nvPicPr>
+                    <pic:cNvPr id="0" name="Picture 7"/>
+                    <pic:cNvPicPr>
+                      <a:picLocks noChangeAspect="1" noChangeArrowheads="1"/>
+                    </pic:cNvPicPr>
+                  </pic:nvPicPr>
+                  <pic:blipFill>
+                    <a:blip r:embed="rId7">
+                      <a:extLst>
+                        <a:ext uri="{28A0092B-C50C-407E-A947-70E740481C1C}">
+                          <a14:useLocalDpi xmlns:a14="http://schemas.microsoft.com/office/drawing/2010/main" val="0"/>
+                        </a:ext>
+                      </a:extLst>
+                    </a:blip>
+                    <a:srcRect/>
+                    <a:stretch>
+                      <a:fillRect/>
+                    </a:stretch>
+                  </pic:blipFill>
+                  <pic:spPr bwMode="auto">
+                    <a:xfrm>
+                      <a:off x="0" y="0"/>
+                      <a:ext cx="6400800" cy="4635500"/>
+                    </a:xfrm>
+                    <a:prstGeom prst="rect">
+                      <a:avLst/>
+                    </a:prstGeom>
+                    <a:noFill/>
+                    <a:ln>
+                      <a:noFill/>
+                    </a:ln>
+                  </pic:spPr>
+                </pic:pic>
+              </a:graphicData>
+            </a:graphic>
+          </wp:inline>
+        </w:drawing>
+      </w:r>
+      <w:r>
+        <w:rPr>
+          <w:rFonts w:hint="eastAsia"/>
+          <w:noProof/>
+        </w:rPr>
+        <w:lastRenderedPageBreak/>
+        <w:drawing>
+          <wp:inline distT="0" distB="0" distL="0" distR="0" wp14:anchorId="554E5E7B" wp14:editId="6D51EB56">
+            <wp:extent cx="6400800" cy="4660900"/>
+            <wp:effectExtent l="0" t="0" r="0" b="6350"/>
+            <wp:docPr id="8" name="Picture 8"/>
+            <wp:cNvGraphicFramePr>
+              <a:graphicFrameLocks xmlns:a="http://schemas.openxmlformats.org/drawingml/2006/main" noChangeAspect="1"/>
+            </wp:cNvGraphicFramePr>
+            <a:graphic xmlns:a="http://schemas.openxmlformats.org/drawingml/2006/main">
+              <a:graphicData uri="http://schemas.openxmlformats.org/drawingml/2006/picture">
+                <pic:pic xmlns:pic="http://schemas.openxmlformats.org/drawingml/2006/picture">
+                  <pic:nvPicPr>
+                    <pic:cNvPr id="0" name="Picture 8"/>
+                    <pic:cNvPicPr>
+                      <a:picLocks noChangeAspect="1" noChangeArrowheads="1"/>
+                    </pic:cNvPicPr>
+                  </pic:nvPicPr>
+                  <pic:blipFill>
+                    <a:blip r:embed="rId8">
+                      <a:extLst>
+                        <a:ext uri="{28A0092B-C50C-407E-A947-70E740481C1C}">
+                          <a14:useLocalDpi xmlns:a14="http://schemas.microsoft.com/office/drawing/2010/main" val="0"/>
+                        </a:ext>
+                      </a:extLst>
+                    </a:blip>
+                    <a:srcRect/>
+                    <a:stretch>
+                      <a:fillRect/>
+                    </a:stretch>
+                  </pic:blipFill>
+                  <pic:spPr bwMode="auto">
+                    <a:xfrm>
+                      <a:off x="0" y="0"/>
+                      <a:ext cx="6400800" cy="4660900"/>
+                    </a:xfrm>
+                    <a:prstGeom prst="rect">
+                      <a:avLst/>
+                    </a:prstGeom>
+                    <a:noFill/>
+                    <a:ln>
+                      <a:noFill/>
+                    </a:ln>
+                  </pic:spPr>
+                </pic:pic>
+              </a:graphicData>
+            </a:graphic>
+          </wp:inline>
+        </w:drawing>
+      </w:r>
+      <w:r>
+        <w:rPr>
+          <w:rFonts w:hint="eastAsia"/>
+          <w:noProof/>
+        </w:rPr>
+        <w:lastRenderedPageBreak/>
+        <w:drawing>
+          <wp:inline distT="0" distB="0" distL="0" distR="0" wp14:anchorId="42F9EAB5" wp14:editId="11600CB4">
+            <wp:extent cx="6388100" cy="4584700"/>
+            <wp:effectExtent l="0" t="0" r="0" b="6350"/>
+            <wp:docPr id="9" name="Picture 9"/>
+            <wp:cNvGraphicFramePr>
+              <a:graphicFrameLocks xmlns:a="http://schemas.openxmlformats.org/drawingml/2006/main" noChangeAspect="1"/>
+            </wp:cNvGraphicFramePr>
+            <a:graphic xmlns:a="http://schemas.openxmlformats.org/drawingml/2006/main">
+              <a:graphicData uri="http://schemas.openxmlformats.org/drawingml/2006/picture">
+                <pic:pic xmlns:pic="http://schemas.openxmlformats.org/drawingml/2006/picture">
+                  <pic:nvPicPr>
+                    <pic:cNvPr id="0" name="Picture 9"/>
+                    <pic:cNvPicPr>
+                      <a:picLocks noChangeAspect="1" noChangeArrowheads="1"/>
+                    </pic:cNvPicPr>
+                  </pic:nvPicPr>
+                  <pic:blipFill>
+                    <a:blip r:embed="rId9">
+                      <a:extLst>
+                        <a:ext uri="{28A0092B-C50C-407E-A947-70E740481C1C}">
+                          <a14:useLocalDpi xmlns:a14="http://schemas.microsoft.com/office/drawing/2010/main" val="0"/>
+                        </a:ext>
+                      </a:extLst>
+                    </a:blip>
+                    <a:srcRect/>
+                    <a:stretch>
+                      <a:fillRect/>
+                    </a:stretch>
+                  </pic:blipFill>
+                  <pic:spPr bwMode="auto">
+                    <a:xfrm>
+                      <a:off x="0" y="0"/>
+                      <a:ext cx="6388100" cy="4584700"/>
+                    </a:xfrm>
+                    <a:prstGeom prst="rect">
+                      <a:avLst/>
+                    </a:prstGeom>
+                    <a:noFill/>
+                    <a:ln>
+                      <a:noFill/>
+                    </a:ln>
+                  </pic:spPr>
+                </pic:pic>
+              </a:graphicData>
+            </a:graphic>
+          </wp:inline>
+        </w:drawing>
+      </w:r>
+      <w:r>
+        <w:rPr>
+          <w:rFonts w:hint="eastAsia"/>
+          <w:noProof/>
+        </w:rPr>
+        <w:lastRenderedPageBreak/>
+        <w:drawing>
+          <wp:inline distT="0" distB="0" distL="0" distR="0" wp14:anchorId="612358E5" wp14:editId="45299B4A">
+            <wp:extent cx="6388100" cy="4432300"/>
+            <wp:effectExtent l="0" t="0" r="0" b="6350"/>
+            <wp:docPr id="10" name="Picture 10"/>
+            <wp:cNvGraphicFramePr>
+              <a:graphicFrameLocks xmlns:a="http://schemas.openxmlformats.org/drawingml/2006/main" noChangeAspect="1"/>
+            </wp:cNvGraphicFramePr>
+            <a:graphic xmlns:a="http://schemas.openxmlformats.org/drawingml/2006/main">
+              <a:graphicData uri="http://schemas.openxmlformats.org/drawingml/2006/picture">
+                <pic:pic xmlns:pic="http://schemas.openxmlformats.org/drawingml/2006/picture">
+                  <pic:nvPicPr>
+                    <pic:cNvPr id="0" name="Picture 10"/>
+                    <pic:cNvPicPr>
+                      <a:picLocks noChangeAspect="1" noChangeArrowheads="1"/>
+                    </pic:cNvPicPr>
+                  </pic:nvPicPr>
+                  <pic:blipFill>
+                    <a:blip r:embed="rId10">
+                      <a:extLst>
+                        <a:ext uri="{28A0092B-C50C-407E-A947-70E740481C1C}">
+                          <a14:useLocalDpi xmlns:a14="http://schemas.microsoft.com/office/drawing/2010/main" val="0"/>
+                        </a:ext>
+                      </a:extLst>
+                    </a:blip>
+                    <a:srcRect/>
+                    <a:stretch>
+                      <a:fillRect/>
+                    </a:stretch>
+                  </pic:blipFill>
+                  <pic:spPr bwMode="auto">
+                    <a:xfrm>
+                      <a:off x="0" y="0"/>
+                      <a:ext cx="6388100" cy="4432300"/>
+                    </a:xfrm>
+                    <a:prstGeom prst="rect">
+                      <a:avLst/>
+                    </a:prstGeom>
+                    <a:noFill/>
+                    <a:ln>
+                      <a:noFill/>
+                    </a:ln>
+                  </pic:spPr>
+                </pic:pic>
+              </a:graphicData>
+            </a:graphic>
+          </wp:inline>
+        </w:drawing>
+      </w:r>
     </w:p>
     <w:sectPr>
       <w:pgSz w:w="12240" w:h="15840"/>
@@ -5464,7 +5767,6 @@
   <w:style w:type="character" w:default="1" w:styleId="DefaultParagraphFont">
     <w:name w:val="Default Paragraph Font"/>
     <w:uiPriority w:val="1"/>
-    <w:semiHidden/>
     <w:unhideWhenUsed/>
   </w:style>
   <w:style w:type="table" w:default="1" w:styleId="TableNormal">

</xml_diff>